<commit_message>
Add PEI application document generator
</commit_message>
<xml_diff>
--- a/10. Advanced Certificate in Applied Quantum Computing and Qiskit Programming/Advanced Certificate in Applied Quantum Computing and Qiskit Programming.docx
+++ b/10. Advanced Certificate in Applied Quantum Computing and Qiskit Programming/Advanced Certificate in Applied Quantum Computing and Qiskit Programming.docx
@@ -128,7 +128,7 @@
               <w:rPr>
                 <w:rFonts w:cs="Arial"/>
               </w:rPr>
-              <w:t>Advanced Certificate in Applied Quantum Computing and Qiskit Programming</w:t>
+              <w:t>Advanced Certificate in Applied Quantum Computing and Quantum Computing Software</w:t>
             </w:r>
           </w:p>
         </w:tc>
@@ -225,7 +225,7 @@
               <w:rPr>
                 <w:rFonts w:cs="Arial"/>
               </w:rPr>
-              <w:t>Advanced Certificate in Applied Quantum Computing and Qiskit Programming</w:t>
+              <w:t>Advanced Certificate in Applied Quantum Computing and Quantum Computing Software</w:t>
             </w:r>
           </w:p>
         </w:tc>
@@ -320,7 +320,7 @@
               <w:rPr>
                 <w:rFonts w:cs="Arial"/>
               </w:rPr>
-              <w:t>The Advanced Certificate in Applied Quantum Computing and Qiskit Programming equips learners with practical, hands-on capability to understand quantum computing concepts, build quantum circuits in Python using Qiskit, execute selected circuits on IBM quantum systems, and interpret circuit behaviour across simulation and real hardware. Upon successful completion, learners will be able to explain qubits and quantum states; configure a Qiskit development environment; implement common single-qubit and multi-qubit gates; analyse circuit identities; apply the Deutsch-Jozsa algorithm; and describe quantum key distribution and quantum teleportation concepts.</w:t>
+              <w:t>The Advanced Certificate in Applied Quantum Computing and Quantum Computing Software equips learners with practical, hands-on capability to understand quantum computing concepts, build quantum circuits in Python using quantum computing software, execute selected circuits on IBM quantum systems, and interpret circuit behaviour across simulation and real hardware. Upon successful completion, learners will be able to explain qubits and quantum states; configure a quantum computing software development environment; implement common single-qubit and multi-qubit gates; analyse circuit identities; apply the Deutsch-Jozsa algorithm; and describe quantum key distribution and quantum teleportation concepts.</w:t>
             </w:r>
           </w:p>
           <w:p>
@@ -824,7 +824,7 @@
                     <w:rPr>
                       <w:rFonts w:cs="Arial"/>
                     </w:rPr>
-                    <w:t>Module 9: Qiskit Installation and Verification</w:t>
+                    <w:t>Module 9: Quantum Computing Software Installation and Verification</w:t>
                   </w:r>
                 </w:p>
               </w:tc>
@@ -842,7 +842,7 @@
                     <w:rPr>
                       <w:rFonts w:cs="Arial"/>
                     </w:rPr>
-                    <w:t>Learners will install Qiskit, validate the development environment, address version considerations and confirm that basic quantum programmes execute correctly.</w:t>
+                    <w:t>Learners will install quantum computing software, validate the development environment, address version considerations and confirm that basic quantum programmes execute correctly.</w:t>
                   </w:r>
                 </w:p>
               </w:tc>
@@ -870,7 +870,7 @@
                     <w:rPr>
                       <w:rFonts w:cs="Arial"/>
                     </w:rPr>
-                    <w:t>Module 10: Building X-Gate Circuits in Qiskit</w:t>
+                    <w:t>Module 10: Building X-Gate Circuits in quantum computing software</w:t>
                   </w:r>
                 </w:p>
               </w:tc>
@@ -888,7 +888,7 @@
                     <w:rPr>
                       <w:rFonts w:cs="Arial"/>
                     </w:rPr>
-                    <w:t>Learners will implement the quantum NOT operation using Qiskit, simulate outcomes and interpret how the X operation changes basis states.</w:t>
+                    <w:t>Learners will implement the quantum NOT operation using quantum computing software, simulate outcomes and interpret how the X operation changes basis states.</w:t>
                   </w:r>
                 </w:p>
               </w:tc>
@@ -1238,7 +1238,7 @@
                     <w:rPr>
                       <w:rFonts w:cs="Arial"/>
                     </w:rPr>
-                    <w:t>Module 18: Implementing Hadamard Circuits in Qiskit</w:t>
+                    <w:t>Module 18: Implementing Hadamard Circuits in quantum computing software</w:t>
                   </w:r>
                 </w:p>
               </w:tc>
@@ -1256,7 +1256,7 @@
                     <w:rPr>
                       <w:rFonts w:cs="Arial"/>
                     </w:rPr>
-                    <w:t>Learners will build Hadamard circuits in Qiskit, simulate them, and interpret their role in creating and measuring superposed states.</w:t>
+                    <w:t>Learners will build Hadamard circuits in quantum computing software, simulate them, and interpret their role in creating and measuring superposed states.</w:t>
                   </w:r>
                 </w:p>
               </w:tc>
@@ -1394,7 +1394,7 @@
                     <w:rPr>
                       <w:rFonts w:cs="Arial"/>
                     </w:rPr>
-                    <w:t>Learners will implement parameterised phase rotations, analyse their effect on quantum states and use Qiskit to visualise phase behaviour.</w:t>
+                    <w:t>Learners will implement parameterised phase rotations, analyse their effect on quantum states and use quantum computing software to visualise phase behaviour.</w:t>
                   </w:r>
                 </w:p>
               </w:tc>
@@ -1947,7 +1947,7 @@
                     <w:rPr>
                       <w:rFonts w:cs="Arial"/>
                     </w:rPr>
-                    <w:t>Learners will apply CNOT circuit identities to transform, simplify and verify equivalent quantum circuits in Qiskit.</w:t>
+                    <w:t>Learners will apply CNOT circuit identities to transform, simplify and verify equivalent quantum circuits in quantum computing software.</w:t>
                   </w:r>
                 </w:p>
               </w:tc>
@@ -2297,7 +2297,7 @@
                     <w:rPr>
                       <w:rFonts w:cs="Arial"/>
                     </w:rPr>
-                    <w:t>Module 41: Deutsch-Jozsa Implementation in Qiskit</w:t>
+                    <w:t>Module 41: Deutsch-Jozsa Implementation in quantum computing software</w:t>
                   </w:r>
                 </w:p>
               </w:tc>
@@ -2315,7 +2315,7 @@
                     <w:rPr>
                       <w:rFonts w:cs="Arial"/>
                     </w:rPr>
-                    <w:t>Learners will implement the Deutsch-Jozsa algorithm in Qiskit, test oracle behaviour and analyse algorithm outputs.</w:t>
+                    <w:t>Learners will implement the Deutsch-Jozsa algorithm in quantum computing software, test oracle behaviour and analyse algorithm outputs.</w:t>
                   </w:r>
                 </w:p>
               </w:tc>
@@ -2536,7 +2536,7 @@
               <w:rPr>
                 <w:rFonts w:cs="Arial"/>
               </w:rPr>
-              <w:t>Learners with basic programming knowledge who want to build and simulate quantum circuits using Qiskit.</w:t>
+              <w:t>Learners with basic programming knowledge who want to build and simulate quantum circuits using quantum computing software.</w:t>
             </w:r>
           </w:p>
           <w:p>
@@ -2649,7 +2649,7 @@
               <w:rPr>
                 <w:rFonts w:cs="Arial"/>
               </w:rPr>
-              <w:t>Graduates of the Advanced Certificate in Applied Quantum Computing and Qiskit Programming can pursue a range of entry-level and emerging technology roles in both the public and private sectors, including:</w:t>
+              <w:t>Graduates of the Advanced Certificate in Applied Quantum Computing and Quantum Computing Software can pursue a range of entry-level and emerging technology roles in both the public and private sectors, including:</w:t>
             </w:r>
           </w:p>
           <w:p>
@@ -2691,7 +2691,7 @@
               <w:rPr>
                 <w:rFonts w:cs="Arial"/>
               </w:rPr>
-              <w:t>• Qiskit Developer / Quantum Circuit Programmer</w:t>
+              <w:t>• Quantum Computing Software Developer / Quantum Circuit Programmer</w:t>
             </w:r>
           </w:p>
           <w:p>
@@ -3248,7 +3248,7 @@
                     <w:rPr>
                       <w:rFonts w:cs="Arial"/>
                     </w:rPr>
-                    <w:t>Hands-on labs in Qiskit notebooks, quantum simulators and IBM Quantum environments (delivered live online)</w:t>
+                    <w:t>Hands-on labs in quantum computing software notebooks, quantum simulators and IBM Quantum environments (delivered live online)</w:t>
                   </w:r>
                 </w:p>
               </w:tc>
@@ -3812,7 +3812,7 @@
                     <w:rPr>
                       <w:rFonts w:cs="Arial"/>
                     </w:rPr>
-                    <w:t>Advanced Certificate in Applied Quantum Computing and Qiskit Programming</w:t>
+                    <w:t>Advanced Certificate in Applied Quantum Computing and Quantum Computing Software</w:t>
                   </w:r>
                 </w:p>
               </w:tc>
@@ -3934,7 +3934,7 @@
                     <w:rPr>
                       <w:rFonts w:cs="Arial"/>
                     </w:rPr>
-                    <w:t>Module 9: Qiskit Installation and Verification</w:t>
+                    <w:t>Module 9: Quantum Computing Software Installation and Verification</w:t>
                   </w:r>
                 </w:p>
                 <w:p>
@@ -3947,7 +3947,7 @@
                     <w:rPr>
                       <w:rFonts w:cs="Arial"/>
                     </w:rPr>
-                    <w:t>Module 10: Building X-Gate Circuits in Qiskit</w:t>
+                    <w:t>Module 10: Building X-Gate Circuits in quantum computing software</w:t>
                   </w:r>
                 </w:p>
                 <w:p>
@@ -4051,7 +4051,7 @@
                     <w:rPr>
                       <w:rFonts w:cs="Arial"/>
                     </w:rPr>
-                    <w:t>Module 18: Implementing Hadamard Circuits in Qiskit</w:t>
+                    <w:t>Module 18: Implementing Hadamard Circuits in quantum computing software</w:t>
                   </w:r>
                 </w:p>
                 <w:p>
@@ -4350,7 +4350,7 @@
                     <w:rPr>
                       <w:rFonts w:cs="Arial"/>
                     </w:rPr>
-                    <w:t>Module 41: Deutsch-Jozsa Implementation in Qiskit</w:t>
+                    <w:t>Module 41: Deutsch-Jozsa Implementation in quantum computing software</w:t>
                   </w:r>
                 </w:p>
                 <w:p>

</xml_diff>